<commit_message>
fix: 修复查询禁止机构 checking_status_id = 2
</commit_message>
<xml_diff>
--- a/WebContent/docx/林奇综合征7基因报告-单样本.docx
+++ b/WebContent/docx/林奇综合征7基因报告-单样本.docx
@@ -2574,16 +2574,16 @@
           </w14:shadow>
         </w:rPr>
       </w:pPr>
-      <w:bookmarkStart w:id="0" w:name="_Toc12428"/>
-      <w:bookmarkStart w:id="1" w:name="_Toc21009_WPSOffice_Level1"/>
-      <w:bookmarkStart w:id="2" w:name="_Toc21669"/>
-      <w:bookmarkStart w:id="3" w:name="_Toc24178_WPSOffice_Level1"/>
-      <w:bookmarkStart w:id="4" w:name="_Toc30143_WPSOffice_Level1"/>
-      <w:bookmarkStart w:id="5" w:name="_Toc13806"/>
-      <w:bookmarkStart w:id="6" w:name="_Toc7021_WPSOffice_Level1"/>
+      <w:bookmarkStart w:id="0" w:name="_Toc13806"/>
+      <w:bookmarkStart w:id="1" w:name="_Toc24178_WPSOffice_Level1"/>
+      <w:bookmarkStart w:id="2" w:name="_Toc21009_WPSOffice_Level1"/>
+      <w:bookmarkStart w:id="3" w:name="_Toc30143_WPSOffice_Level1"/>
+      <w:bookmarkStart w:id="4" w:name="_Toc12428"/>
+      <w:bookmarkStart w:id="5" w:name="_Toc21669"/>
+      <w:bookmarkStart w:id="6" w:name="_Toc17451"/>
       <w:bookmarkStart w:id="7" w:name="_Toc11015_WPSOffice_Level1"/>
-      <w:bookmarkStart w:id="8" w:name="_Toc18062_WPSOffice_Level1"/>
-      <w:bookmarkStart w:id="9" w:name="_Toc17451"/>
+      <w:bookmarkStart w:id="8" w:name="_Toc7021_WPSOffice_Level1"/>
+      <w:bookmarkStart w:id="9" w:name="_Toc18062_WPSOffice_Level1"/>
       <w:bookmarkStart w:id="10" w:name="_Toc3823"/>
       <w:r>
         <w:rPr>
@@ -4024,13 +4024,13 @@
       </w:pPr>
       <w:bookmarkStart w:id="13" w:name="_Toc16576"/>
       <w:bookmarkStart w:id="14" w:name="_Toc149837253"/>
-      <w:bookmarkStart w:id="15" w:name="_Toc13049"/>
-      <w:bookmarkStart w:id="16" w:name="_Toc16518"/>
-      <w:bookmarkStart w:id="17" w:name="_Toc18825"/>
+      <w:bookmarkStart w:id="15" w:name="_Toc16518"/>
+      <w:bookmarkStart w:id="16" w:name="_Toc18825"/>
+      <w:bookmarkStart w:id="17" w:name="_Toc13049"/>
       <w:bookmarkStart w:id="18" w:name="_Toc25920"/>
-      <w:bookmarkStart w:id="19" w:name="_Toc23369_WPSOffice_Level1"/>
-      <w:bookmarkStart w:id="20" w:name="_Toc18058"/>
-      <w:bookmarkStart w:id="21" w:name="_Toc6221_WPSOffice_Level1"/>
+      <w:bookmarkStart w:id="19" w:name="_Toc6221_WPSOffice_Level1"/>
+      <w:bookmarkStart w:id="20" w:name="_Toc23369_WPSOffice_Level1"/>
+      <w:bookmarkStart w:id="21" w:name="_Toc18058"/>
       <w:bookmarkStart w:id="22" w:name="_Toc534807930"/>
       <w:r>
         <w:rPr>
@@ -4095,10 +4095,10 @@
           <w:lang w:eastAsia="zh-CN"/>
         </w:rPr>
       </w:pPr>
-      <w:bookmarkStart w:id="23" w:name="_Toc27955"/>
+      <w:bookmarkStart w:id="23" w:name="_Toc149837254"/>
       <w:bookmarkStart w:id="24" w:name="_Toc30244"/>
-      <w:bookmarkStart w:id="25" w:name="_Toc149837254"/>
-      <w:bookmarkStart w:id="26" w:name="_Toc17155"/>
+      <w:bookmarkStart w:id="25" w:name="_Toc17155"/>
+      <w:bookmarkStart w:id="26" w:name="_Toc27955"/>
       <w:r>
         <w:rPr>
           <w:rFonts w:hint="eastAsia"/>
@@ -4885,9 +4885,9 @@
         </w:rPr>
       </w:pPr>
       <w:bookmarkStart w:id="27" w:name="_Toc7980"/>
-      <w:bookmarkStart w:id="28" w:name="_Toc12727"/>
-      <w:bookmarkStart w:id="29" w:name="_Toc13186"/>
-      <w:bookmarkStart w:id="30" w:name="_Toc149837260"/>
+      <w:bookmarkStart w:id="28" w:name="_Toc149837260"/>
+      <w:bookmarkStart w:id="29" w:name="_Toc12727"/>
+      <w:bookmarkStart w:id="30" w:name="_Toc13186"/>
       <w:r>
         <w:rPr>
           <w:rFonts w:ascii="Times New Roman" w:hAnsi="Times New Roman" w:eastAsia="微软雅黑" w:cs="黑体"/>
@@ -4955,8 +4955,8 @@
           <w:lang w:eastAsia="zh-CN"/>
         </w:rPr>
       </w:pPr>
-      <w:bookmarkStart w:id="32" w:name="_Toc2788"/>
-      <w:bookmarkStart w:id="33" w:name="_Toc26666"/>
+      <w:bookmarkStart w:id="32" w:name="_Toc26666"/>
+      <w:bookmarkStart w:id="33" w:name="_Toc2788"/>
       <w:r>
         <w:rPr>
           <w:rFonts w:hint="eastAsia"/>
@@ -5197,6 +5197,12 @@
             <w:insideH w:val="single" w:color="A4A4A4" w:sz="4" w:space="0"/>
             <w:insideV w:val="single" w:color="A4A4A4" w:sz="4" w:space="0"/>
           </w:tblBorders>
+          <w:tblCellMar>
+            <w:top w:w="0" w:type="dxa"/>
+            <w:left w:w="0" w:type="dxa"/>
+            <w:bottom w:w="0" w:type="dxa"/>
+            <w:right w:w="0" w:type="dxa"/>
+          </w:tblCellMar>
         </w:tblPrEx>
         <w:trPr>
           <w:trHeight w:val="510" w:hRule="exact"/>
@@ -8920,10 +8926,10 @@
           <w:lang w:eastAsia="zh-CN"/>
         </w:rPr>
       </w:pPr>
-      <w:bookmarkStart w:id="36" w:name="_Toc20303"/>
-      <w:bookmarkStart w:id="37" w:name="_Toc11958"/>
-      <w:bookmarkStart w:id="38" w:name="_Toc149837265"/>
-      <w:bookmarkStart w:id="39" w:name="_Toc5547"/>
+      <w:bookmarkStart w:id="36" w:name="_Toc11958"/>
+      <w:bookmarkStart w:id="37" w:name="_Toc20303"/>
+      <w:bookmarkStart w:id="38" w:name="_Toc5547"/>
+      <w:bookmarkStart w:id="39" w:name="_Toc149837265"/>
       <w:r>
         <w:rPr>
           <w:rFonts w:hint="eastAsia"/>
@@ -11069,73 +11075,10 @@
                 <w:szCs w:val="18"/>
                 <w:lang w:eastAsia="zh-CN"/>
               </w:rPr>
-              <w:t>{% endif %}{% endfor %}受检者检出{{ tdd.gene }}{{tdd.Clinical_significance}}</w:t>
+              <w:t>{% endif %}{% endfor %}</w:t>
             </w:r>
             <w:bookmarkStart w:id="62" w:name="_GoBack"/>
             <w:bookmarkEnd w:id="62"/>
-            <w:r>
-              <w:rPr>
-                <w:rFonts w:hint="eastAsia" w:ascii="Times New Roman" w:hAnsi="Times New Roman" w:eastAsia="微软雅黑" w:cs="Times New Roman"/>
-                <w:sz w:val="18"/>
-                <w:szCs w:val="18"/>
-                <w:lang w:eastAsia="zh-CN"/>
-              </w:rPr>
-              <w:t>，可能使其患林奇综合征的风险增加，</w:t>
-            </w:r>
-            <w:r>
-              <w:rPr>
-                <w:rFonts w:hint="eastAsia" w:ascii="Times New Roman" w:hAnsi="Times New Roman" w:eastAsia="微软雅黑" w:cs="Times New Roman"/>
-                <w:sz w:val="18"/>
-                <w:szCs w:val="18"/>
-                <w:lang w:val="en-US" w:eastAsia="zh-CN"/>
-              </w:rPr>
-              <w:t>同时患</w:t>
-            </w:r>
-            <w:r>
-              <w:rPr>
-                <w:rFonts w:hint="eastAsia" w:ascii="Times New Roman" w:hAnsi="Times New Roman" w:eastAsia="微软雅黑" w:cs="Times New Roman"/>
-                <w:sz w:val="18"/>
-                <w:szCs w:val="18"/>
-                <w:lang w:eastAsia="zh-CN"/>
-              </w:rPr>
-              <w:t>结直肠癌、子宫内膜癌、胃癌、卵巢癌等多种癌症的风险高于一般人群，</w:t>
-            </w:r>
-            <w:r>
-              <w:rPr>
-                <w:rFonts w:hint="eastAsia" w:ascii="Times New Roman" w:hAnsi="Times New Roman" w:eastAsia="微软雅黑" w:cs="Times New Roman"/>
-                <w:sz w:val="18"/>
-                <w:szCs w:val="18"/>
-                <w:lang w:val="en-US" w:eastAsia="zh-CN"/>
-              </w:rPr>
-              <w:t>建议其进行定期</w:t>
-            </w:r>
-            <w:r>
-              <w:rPr>
-                <w:rFonts w:hint="eastAsia" w:ascii="Times New Roman" w:hAnsi="Times New Roman" w:eastAsia="微软雅黑" w:cs="Times New Roman"/>
-                <w:sz w:val="18"/>
-                <w:szCs w:val="18"/>
-                <w:lang w:eastAsia="zh-CN"/>
-              </w:rPr>
-              <w:t>癌症筛查，以便</w:t>
-            </w:r>
-            <w:r>
-              <w:rPr>
-                <w:rFonts w:hint="eastAsia" w:ascii="Times New Roman" w:hAnsi="Times New Roman" w:eastAsia="微软雅黑" w:cs="Times New Roman"/>
-                <w:sz w:val="18"/>
-                <w:szCs w:val="18"/>
-                <w:lang w:val="en-US" w:eastAsia="zh-CN"/>
-              </w:rPr>
-              <w:t>早发现早治疗</w:t>
-            </w:r>
-            <w:r>
-              <w:rPr>
-                <w:rFonts w:hint="eastAsia" w:ascii="Times New Roman" w:hAnsi="Times New Roman" w:eastAsia="微软雅黑" w:cs="Times New Roman"/>
-                <w:sz w:val="18"/>
-                <w:szCs w:val="18"/>
-                <w:lang w:eastAsia="zh-CN"/>
-              </w:rPr>
-              <w:t>。</w:t>
-            </w:r>
           </w:p>
         </w:tc>
       </w:tr>
@@ -13378,8 +13321,8 @@
           <w:lang w:eastAsia="zh-CN"/>
         </w:rPr>
       </w:pPr>
-      <w:bookmarkStart w:id="41" w:name="_Toc15840_WPSOffice_Level1"/>
-      <w:bookmarkStart w:id="42" w:name="_Toc7959"/>
+      <w:bookmarkStart w:id="41" w:name="_Toc7959"/>
+      <w:bookmarkStart w:id="42" w:name="_Toc15840_WPSOffice_Level1"/>
       <w:bookmarkStart w:id="43" w:name="_Toc14255_WPSOffice_Level1"/>
       <w:r>
         <w:rPr>
@@ -15925,8 +15868,8 @@
         </w:rPr>
       </w:pPr>
       <w:bookmarkStart w:id="48" w:name="_Toc7917"/>
-      <w:bookmarkStart w:id="49" w:name="_Toc20170_WPSOffice_Level1"/>
-      <w:bookmarkStart w:id="50" w:name="_Toc28454_WPSOffice_Level1"/>
+      <w:bookmarkStart w:id="49" w:name="_Toc28454_WPSOffice_Level1"/>
+      <w:bookmarkStart w:id="50" w:name="_Toc20170_WPSOffice_Level1"/>
       <w:bookmarkStart w:id="51" w:name="_Toc26985_WPSOffice_Level1"/>
       <w:r>
         <w:rPr>
@@ -16659,9 +16602,9 @@
           <w:lang w:eastAsia="zh-CN"/>
         </w:rPr>
       </w:pPr>
-      <w:bookmarkStart w:id="52" w:name="_Toc15114"/>
+      <w:bookmarkStart w:id="52" w:name="_Toc18694"/>
       <w:bookmarkStart w:id="53" w:name="_Toc3409"/>
-      <w:bookmarkStart w:id="54" w:name="_Toc18694"/>
+      <w:bookmarkStart w:id="54" w:name="_Toc15114"/>
       <w:r>
         <w:rPr>
           <w:rFonts w:hint="eastAsia"/>
@@ -16975,9 +16918,9 @@
         </w:rPr>
       </w:pPr>
       <w:bookmarkStart w:id="56" w:name="_Toc17954"/>
-      <w:bookmarkStart w:id="57" w:name="_Toc14611_WPSOffice_Level1"/>
-      <w:bookmarkStart w:id="58" w:name="_Toc22623"/>
-      <w:bookmarkStart w:id="59" w:name="_Toc22162_WPSOffice_Level1"/>
+      <w:bookmarkStart w:id="57" w:name="_Toc22623"/>
+      <w:bookmarkStart w:id="58" w:name="_Toc22162_WPSOffice_Level1"/>
+      <w:bookmarkStart w:id="59" w:name="_Toc14611_WPSOffice_Level1"/>
       <w:bookmarkStart w:id="60" w:name="_Toc13275"/>
       <w:bookmarkStart w:id="61" w:name="_Toc19584_WPSOffice_Level1"/>
       <w:r>

</xml_diff>